<commit_message>
Add one-page written reply to the client brief
Document 16 is a single-page letter to send ahead of the first meeting:
our reading of the two requirements, a table of what we would add beyond
the stated minimum, short answers to their four questions, and the five
inputs we need from them to firm up scope and price.

Adds letterhead and compact modes to the docx helper (no cover page, no
running header, tighter type) so a document can be held to one page.
Other documents are unaffected; page counts verified unchanged.

Co-Authored-By: Claude Opus 5 <noreply@anthropic.com>
Claude-Session: https://claude.ai/code/session_01HFs5ZvxcqCGpfu8ascDZDB
</commit_message>
<xml_diff>
--- a/proposal/03_Solution_Architecture_High_and_Low_Level.docx
+++ b/proposal/03_Solution_Architecture_High_and_Low_Level.docx
@@ -392,7 +392,7 @@
             </w:rPr>
             <w:fldChar w:fldCharType="separate"/>
           </w:r>
-          <w:hyperlink w:anchor="__RefHeading___Toc1235_3719902292">
+          <w:hyperlink w:anchor="__RefHeading___Toc1235_2871792748">
             <w:r>
               <w:rPr>
                 <w:rStyle w:val="IndexLink"/>
@@ -412,7 +412,7 @@
             </w:tabs>
             <w:rPr/>
           </w:pPr>
-          <w:hyperlink w:anchor="__RefHeading___Toc1237_3719902292">
+          <w:hyperlink w:anchor="__RefHeading___Toc1237_2871792748">
             <w:r>
               <w:rPr>
                 <w:rStyle w:val="IndexLink"/>
@@ -432,7 +432,7 @@
             </w:tabs>
             <w:rPr/>
           </w:pPr>
-          <w:hyperlink w:anchor="__RefHeading___Toc1239_3719902292">
+          <w:hyperlink w:anchor="__RefHeading___Toc1239_2871792748">
             <w:r>
               <w:rPr>
                 <w:rStyle w:val="IndexLink"/>
@@ -452,7 +452,7 @@
             </w:tabs>
             <w:rPr/>
           </w:pPr>
-          <w:hyperlink w:anchor="__RefHeading___Toc1241_3719902292">
+          <w:hyperlink w:anchor="__RefHeading___Toc1241_2871792748">
             <w:r>
               <w:rPr>
                 <w:rStyle w:val="IndexLink"/>
@@ -472,7 +472,7 @@
             </w:tabs>
             <w:rPr/>
           </w:pPr>
-          <w:hyperlink w:anchor="__RefHeading___Toc1243_3719902292">
+          <w:hyperlink w:anchor="__RefHeading___Toc1243_2871792748">
             <w:r>
               <w:rPr>
                 <w:rStyle w:val="IndexLink"/>
@@ -492,7 +492,7 @@
             </w:tabs>
             <w:rPr/>
           </w:pPr>
-          <w:hyperlink w:anchor="__RefHeading___Toc1245_3719902292">
+          <w:hyperlink w:anchor="__RefHeading___Toc1245_2871792748">
             <w:r>
               <w:rPr>
                 <w:rStyle w:val="IndexLink"/>
@@ -512,7 +512,7 @@
             </w:tabs>
             <w:rPr/>
           </w:pPr>
-          <w:hyperlink w:anchor="__RefHeading___Toc1247_3719902292">
+          <w:hyperlink w:anchor="__RefHeading___Toc1247_2871792748">
             <w:r>
               <w:rPr>
                 <w:rStyle w:val="IndexLink"/>
@@ -532,7 +532,7 @@
             </w:tabs>
             <w:rPr/>
           </w:pPr>
-          <w:hyperlink w:anchor="__RefHeading___Toc1249_3719902292">
+          <w:hyperlink w:anchor="__RefHeading___Toc1249_2871792748">
             <w:r>
               <w:rPr>
                 <w:rStyle w:val="IndexLink"/>
@@ -552,7 +552,7 @@
             </w:tabs>
             <w:rPr/>
           </w:pPr>
-          <w:hyperlink w:anchor="__RefHeading___Toc1251_3719902292">
+          <w:hyperlink w:anchor="__RefHeading___Toc1251_2871792748">
             <w:r>
               <w:rPr>
                 <w:rStyle w:val="IndexLink"/>
@@ -572,7 +572,7 @@
             </w:tabs>
             <w:rPr/>
           </w:pPr>
-          <w:hyperlink w:anchor="__RefHeading___Toc1253_3719902292">
+          <w:hyperlink w:anchor="__RefHeading___Toc1253_2871792748">
             <w:r>
               <w:rPr>
                 <w:rStyle w:val="IndexLink"/>
@@ -592,7 +592,7 @@
             </w:tabs>
             <w:rPr/>
           </w:pPr>
-          <w:hyperlink w:anchor="__RefHeading___Toc1255_3719902292">
+          <w:hyperlink w:anchor="__RefHeading___Toc1255_2871792748">
             <w:r>
               <w:rPr>
                 <w:rStyle w:val="IndexLink"/>
@@ -612,7 +612,7 @@
             </w:tabs>
             <w:rPr/>
           </w:pPr>
-          <w:hyperlink w:anchor="__RefHeading___Toc1257_3719902292">
+          <w:hyperlink w:anchor="__RefHeading___Toc1257_2871792748">
             <w:r>
               <w:rPr>
                 <w:rStyle w:val="IndexLink"/>
@@ -632,7 +632,7 @@
             </w:tabs>
             <w:rPr/>
           </w:pPr>
-          <w:hyperlink w:anchor="__RefHeading___Toc1259_3719902292">
+          <w:hyperlink w:anchor="__RefHeading___Toc1259_2871792748">
             <w:r>
               <w:rPr>
                 <w:rStyle w:val="IndexLink"/>
@@ -652,7 +652,7 @@
             </w:tabs>
             <w:rPr/>
           </w:pPr>
-          <w:hyperlink w:anchor="__RefHeading___Toc1261_3719902292">
+          <w:hyperlink w:anchor="__RefHeading___Toc1261_2871792748">
             <w:r>
               <w:rPr>
                 <w:rStyle w:val="IndexLink"/>
@@ -672,7 +672,7 @@
             </w:tabs>
             <w:rPr/>
           </w:pPr>
-          <w:hyperlink w:anchor="__RefHeading___Toc1263_3719902292">
+          <w:hyperlink w:anchor="__RefHeading___Toc1263_2871792748">
             <w:r>
               <w:rPr>
                 <w:rStyle w:val="IndexLink"/>
@@ -692,7 +692,7 @@
             </w:tabs>
             <w:rPr/>
           </w:pPr>
-          <w:hyperlink w:anchor="__RefHeading___Toc1265_3719902292">
+          <w:hyperlink w:anchor="__RefHeading___Toc1265_2871792748">
             <w:r>
               <w:rPr>
                 <w:rStyle w:val="IndexLink"/>
@@ -712,7 +712,7 @@
             </w:tabs>
             <w:rPr/>
           </w:pPr>
-          <w:hyperlink w:anchor="__RefHeading___Toc1267_3719902292">
+          <w:hyperlink w:anchor="__RefHeading___Toc1267_2871792748">
             <w:r>
               <w:rPr>
                 <w:rStyle w:val="IndexLink"/>
@@ -732,7 +732,7 @@
             </w:tabs>
             <w:rPr/>
           </w:pPr>
-          <w:hyperlink w:anchor="__RefHeading___Toc1269_3719902292">
+          <w:hyperlink w:anchor="__RefHeading___Toc1269_2871792748">
             <w:r>
               <w:rPr>
                 <w:rStyle w:val="IndexLink"/>
@@ -752,7 +752,7 @@
             </w:tabs>
             <w:rPr/>
           </w:pPr>
-          <w:hyperlink w:anchor="__RefHeading___Toc1271_3719902292">
+          <w:hyperlink w:anchor="__RefHeading___Toc1271_2871792748">
             <w:r>
               <w:rPr>
                 <w:rStyle w:val="IndexLink"/>
@@ -772,7 +772,7 @@
             </w:tabs>
             <w:rPr/>
           </w:pPr>
-          <w:hyperlink w:anchor="__RefHeading___Toc1273_3719902292">
+          <w:hyperlink w:anchor="__RefHeading___Toc1273_2871792748">
             <w:r>
               <w:rPr>
                 <w:rStyle w:val="IndexLink"/>
@@ -792,7 +792,7 @@
             </w:tabs>
             <w:rPr/>
           </w:pPr>
-          <w:hyperlink w:anchor="__RefHeading___Toc1275_3719902292">
+          <w:hyperlink w:anchor="__RefHeading___Toc1275_2871792748">
             <w:r>
               <w:rPr>
                 <w:rStyle w:val="IndexLink"/>
@@ -812,7 +812,7 @@
             </w:tabs>
             <w:rPr/>
           </w:pPr>
-          <w:hyperlink w:anchor="__RefHeading___Toc1277_3719902292">
+          <w:hyperlink w:anchor="__RefHeading___Toc1277_2871792748">
             <w:r>
               <w:rPr>
                 <w:rStyle w:val="IndexLink"/>
@@ -832,7 +832,7 @@
             </w:tabs>
             <w:rPr/>
           </w:pPr>
-          <w:hyperlink w:anchor="__RefHeading___Toc1279_3719902292">
+          <w:hyperlink w:anchor="__RefHeading___Toc1279_2871792748">
             <w:r>
               <w:rPr>
                 <w:rStyle w:val="IndexLink"/>
@@ -852,7 +852,7 @@
             </w:tabs>
             <w:rPr/>
           </w:pPr>
-          <w:hyperlink w:anchor="__RefHeading___Toc1281_3719902292">
+          <w:hyperlink w:anchor="__RefHeading___Toc1281_2871792748">
             <w:r>
               <w:rPr>
                 <w:rStyle w:val="IndexLink"/>
@@ -872,7 +872,7 @@
             </w:tabs>
             <w:rPr/>
           </w:pPr>
-          <w:hyperlink w:anchor="__RefHeading___Toc1283_3719902292">
+          <w:hyperlink w:anchor="__RefHeading___Toc1283_2871792748">
             <w:r>
               <w:rPr>
                 <w:rStyle w:val="IndexLink"/>
@@ -892,7 +892,7 @@
             </w:tabs>
             <w:rPr/>
           </w:pPr>
-          <w:hyperlink w:anchor="__RefHeading___Toc1285_3719902292">
+          <w:hyperlink w:anchor="__RefHeading___Toc1285_2871792748">
             <w:r>
               <w:rPr>
                 <w:rStyle w:val="IndexLink"/>
@@ -912,7 +912,7 @@
             </w:tabs>
             <w:rPr/>
           </w:pPr>
-          <w:hyperlink w:anchor="__RefHeading___Toc1287_3719902292">
+          <w:hyperlink w:anchor="__RefHeading___Toc1287_2871792748">
             <w:r>
               <w:rPr>
                 <w:rStyle w:val="IndexLink"/>
@@ -932,7 +932,7 @@
             </w:tabs>
             <w:rPr/>
           </w:pPr>
-          <w:hyperlink w:anchor="__RefHeading___Toc1289_3719902292">
+          <w:hyperlink w:anchor="__RefHeading___Toc1289_2871792748">
             <w:r>
               <w:rPr>
                 <w:rStyle w:val="IndexLink"/>
@@ -952,7 +952,7 @@
             </w:tabs>
             <w:rPr/>
           </w:pPr>
-          <w:hyperlink w:anchor="__RefHeading___Toc1291_3719902292">
+          <w:hyperlink w:anchor="__RefHeading___Toc1291_2871792748">
             <w:r>
               <w:rPr>
                 <w:rStyle w:val="IndexLink"/>
@@ -972,7 +972,7 @@
             </w:tabs>
             <w:rPr/>
           </w:pPr>
-          <w:hyperlink w:anchor="__RefHeading___Toc1293_3719902292">
+          <w:hyperlink w:anchor="__RefHeading___Toc1293_2871792748">
             <w:r>
               <w:rPr>
                 <w:rStyle w:val="IndexLink"/>
@@ -992,7 +992,7 @@
             </w:tabs>
             <w:rPr/>
           </w:pPr>
-          <w:hyperlink w:anchor="__RefHeading___Toc1295_3719902292">
+          <w:hyperlink w:anchor="__RefHeading___Toc1295_2871792748">
             <w:r>
               <w:rPr>
                 <w:rStyle w:val="IndexLink"/>
@@ -1012,7 +1012,7 @@
             </w:tabs>
             <w:rPr/>
           </w:pPr>
-          <w:hyperlink w:anchor="__RefHeading___Toc1297_3719902292">
+          <w:hyperlink w:anchor="__RefHeading___Toc1297_2871792748">
             <w:r>
               <w:rPr>
                 <w:rStyle w:val="IndexLink"/>
@@ -1032,7 +1032,7 @@
             </w:tabs>
             <w:rPr/>
           </w:pPr>
-          <w:hyperlink w:anchor="__RefHeading___Toc1299_3719902292">
+          <w:hyperlink w:anchor="__RefHeading___Toc1299_2871792748">
             <w:r>
               <w:rPr>
                 <w:rStyle w:val="IndexLink"/>
@@ -1052,7 +1052,7 @@
             </w:tabs>
             <w:rPr/>
           </w:pPr>
-          <w:hyperlink w:anchor="__RefHeading___Toc1301_3719902292">
+          <w:hyperlink w:anchor="__RefHeading___Toc1301_2871792748">
             <w:r>
               <w:rPr>
                 <w:rStyle w:val="IndexLink"/>
@@ -1072,7 +1072,7 @@
             </w:tabs>
             <w:rPr/>
           </w:pPr>
-          <w:hyperlink w:anchor="__RefHeading___Toc1303_3719902292">
+          <w:hyperlink w:anchor="__RefHeading___Toc1303_2871792748">
             <w:r>
               <w:rPr>
                 <w:rStyle w:val="IndexLink"/>
@@ -1092,7 +1092,7 @@
             </w:tabs>
             <w:rPr/>
           </w:pPr>
-          <w:hyperlink w:anchor="__RefHeading___Toc1305_3719902292">
+          <w:hyperlink w:anchor="__RefHeading___Toc1305_2871792748">
             <w:r>
               <w:rPr>
                 <w:rStyle w:val="IndexLink"/>
@@ -1138,7 +1138,7 @@
         <w:spacing w:before="0" w:after="160"/>
         <w:rPr/>
       </w:pPr>
-      <w:bookmarkStart w:id="0" w:name="__RefHeading___Toc1235_3719902292"/>
+      <w:bookmarkStart w:id="0" w:name="__RefHeading___Toc1235_2871792748"/>
       <w:bookmarkEnd w:id="0"/>
       <w:r>
         <w:rPr/>
@@ -1406,7 +1406,7 @@
         <w:spacing w:before="360" w:after="160"/>
         <w:rPr/>
       </w:pPr>
-      <w:bookmarkStart w:id="1" w:name="__RefHeading___Toc1237_3719902292"/>
+      <w:bookmarkStart w:id="1" w:name="__RefHeading___Toc1237_2871792748"/>
       <w:bookmarkEnd w:id="1"/>
       <w:r>
         <w:rPr/>
@@ -1419,7 +1419,7 @@
         <w:spacing w:before="280" w:after="120"/>
         <w:rPr/>
       </w:pPr>
-      <w:bookmarkStart w:id="2" w:name="__RefHeading___Toc1239_3719902292"/>
+      <w:bookmarkStart w:id="2" w:name="__RefHeading___Toc1239_2871792748"/>
       <w:bookmarkEnd w:id="2"/>
       <w:r>
         <w:rPr/>
@@ -1901,7 +1901,7 @@
         <w:spacing w:before="280" w:after="120"/>
         <w:rPr/>
       </w:pPr>
-      <w:bookmarkStart w:id="3" w:name="__RefHeading___Toc1241_3719902292"/>
+      <w:bookmarkStart w:id="3" w:name="__RefHeading___Toc1241_2871792748"/>
       <w:bookmarkEnd w:id="3"/>
       <w:r>
         <w:rPr/>
@@ -2467,7 +2467,7 @@
         <w:spacing w:before="280" w:after="120"/>
         <w:rPr/>
       </w:pPr>
-      <w:bookmarkStart w:id="4" w:name="__RefHeading___Toc1243_3719902292"/>
+      <w:bookmarkStart w:id="4" w:name="__RefHeading___Toc1243_2871792748"/>
       <w:bookmarkEnd w:id="4"/>
       <w:r>
         <w:rPr/>
@@ -2568,7 +2568,7 @@
         <w:spacing w:before="360" w:after="160"/>
         <w:rPr/>
       </w:pPr>
-      <w:bookmarkStart w:id="5" w:name="__RefHeading___Toc1245_3719902292"/>
+      <w:bookmarkStart w:id="5" w:name="__RefHeading___Toc1245_2871792748"/>
       <w:bookmarkEnd w:id="5"/>
       <w:r>
         <w:rPr/>
@@ -2647,7 +2647,7 @@
         <w:spacing w:before="280" w:after="120"/>
         <w:rPr/>
       </w:pPr>
-      <w:bookmarkStart w:id="6" w:name="__RefHeading___Toc1247_3719902292"/>
+      <w:bookmarkStart w:id="6" w:name="__RefHeading___Toc1247_2871792748"/>
       <w:bookmarkEnd w:id="6"/>
       <w:r>
         <w:rPr/>
@@ -2693,7 +2693,7 @@
         <w:spacing w:before="280" w:after="120"/>
         <w:rPr/>
       </w:pPr>
-      <w:bookmarkStart w:id="7" w:name="__RefHeading___Toc1249_3719902292"/>
+      <w:bookmarkStart w:id="7" w:name="__RefHeading___Toc1249_2871792748"/>
       <w:bookmarkEnd w:id="7"/>
       <w:r>
         <w:rPr/>
@@ -3430,7 +3430,7 @@
         <w:spacing w:before="280" w:after="120"/>
         <w:rPr/>
       </w:pPr>
-      <w:bookmarkStart w:id="8" w:name="__RefHeading___Toc1251_3719902292"/>
+      <w:bookmarkStart w:id="8" w:name="__RefHeading___Toc1251_2871792748"/>
       <w:bookmarkEnd w:id="8"/>
       <w:r>
         <w:rPr/>
@@ -3619,7 +3619,7 @@
         <w:spacing w:before="280" w:after="120"/>
         <w:rPr/>
       </w:pPr>
-      <w:bookmarkStart w:id="9" w:name="__RefHeading___Toc1253_3719902292"/>
+      <w:bookmarkStart w:id="9" w:name="__RefHeading___Toc1253_2871792748"/>
       <w:bookmarkEnd w:id="9"/>
       <w:r>
         <w:rPr/>
@@ -3709,7 +3709,7 @@
         <w:spacing w:before="280" w:after="120"/>
         <w:rPr/>
       </w:pPr>
-      <w:bookmarkStart w:id="10" w:name="__RefHeading___Toc1255_3719902292"/>
+      <w:bookmarkStart w:id="10" w:name="__RefHeading___Toc1255_2871792748"/>
       <w:bookmarkEnd w:id="10"/>
       <w:r>
         <w:rPr/>
@@ -3887,7 +3887,7 @@
         <w:spacing w:before="360" w:after="160"/>
         <w:rPr/>
       </w:pPr>
-      <w:bookmarkStart w:id="11" w:name="__RefHeading___Toc1257_3719902292"/>
+      <w:bookmarkStart w:id="11" w:name="__RefHeading___Toc1257_2871792748"/>
       <w:bookmarkEnd w:id="11"/>
       <w:r>
         <w:rPr/>
@@ -4343,7 +4343,7 @@
         <w:spacing w:before="360" w:after="160"/>
         <w:rPr/>
       </w:pPr>
-      <w:bookmarkStart w:id="12" w:name="__RefHeading___Toc1259_3719902292"/>
+      <w:bookmarkStart w:id="12" w:name="__RefHeading___Toc1259_2871792748"/>
       <w:bookmarkEnd w:id="12"/>
       <w:r>
         <w:rPr/>
@@ -4543,7 +4543,7 @@
         <w:spacing w:before="360" w:after="160"/>
         <w:rPr/>
       </w:pPr>
-      <w:bookmarkStart w:id="13" w:name="__RefHeading___Toc1261_3719902292"/>
+      <w:bookmarkStart w:id="13" w:name="__RefHeading___Toc1261_2871792748"/>
       <w:bookmarkEnd w:id="13"/>
       <w:r>
         <w:rPr/>
@@ -5285,7 +5285,7 @@
         <w:spacing w:before="0" w:after="160"/>
         <w:rPr/>
       </w:pPr>
-      <w:bookmarkStart w:id="14" w:name="__RefHeading___Toc1263_3719902292"/>
+      <w:bookmarkStart w:id="14" w:name="__RefHeading___Toc1263_2871792748"/>
       <w:bookmarkEnd w:id="14"/>
       <w:r>
         <w:rPr/>
@@ -5298,7 +5298,7 @@
         <w:spacing w:before="360" w:after="160"/>
         <w:rPr/>
       </w:pPr>
-      <w:bookmarkStart w:id="15" w:name="__RefHeading___Toc1265_3719902292"/>
+      <w:bookmarkStart w:id="15" w:name="__RefHeading___Toc1265_2871792748"/>
       <w:bookmarkEnd w:id="15"/>
       <w:r>
         <w:rPr/>
@@ -5311,7 +5311,7 @@
         <w:spacing w:before="280" w:after="120"/>
         <w:rPr/>
       </w:pPr>
-      <w:bookmarkStart w:id="16" w:name="__RefHeading___Toc1267_3719902292"/>
+      <w:bookmarkStart w:id="16" w:name="__RefHeading___Toc1267_2871792748"/>
       <w:bookmarkEnd w:id="16"/>
       <w:r>
         <w:rPr/>
@@ -6219,7 +6219,7 @@
         <w:spacing w:before="280" w:after="120"/>
         <w:rPr/>
       </w:pPr>
-      <w:bookmarkStart w:id="17" w:name="__RefHeading___Toc1269_3719902292"/>
+      <w:bookmarkStart w:id="17" w:name="__RefHeading___Toc1269_2871792748"/>
       <w:bookmarkEnd w:id="17"/>
       <w:r>
         <w:rPr/>
@@ -6299,7 +6299,7 @@
         <w:spacing w:before="360" w:after="160"/>
         <w:rPr/>
       </w:pPr>
-      <w:bookmarkStart w:id="18" w:name="__RefHeading___Toc1271_3719902292"/>
+      <w:bookmarkStart w:id="18" w:name="__RefHeading___Toc1271_2871792748"/>
       <w:bookmarkEnd w:id="18"/>
       <w:r>
         <w:rPr/>
@@ -6323,7 +6323,7 @@
         <w:spacing w:before="280" w:after="120"/>
         <w:rPr/>
       </w:pPr>
-      <w:bookmarkStart w:id="19" w:name="__RefHeading___Toc1273_3719902292"/>
+      <w:bookmarkStart w:id="19" w:name="__RefHeading___Toc1273_2871792748"/>
       <w:bookmarkEnd w:id="19"/>
       <w:r>
         <w:rPr/>
@@ -6895,7 +6895,7 @@
         <w:spacing w:before="280" w:after="120"/>
         <w:rPr/>
       </w:pPr>
-      <w:bookmarkStart w:id="20" w:name="__RefHeading___Toc1275_3719902292"/>
+      <w:bookmarkStart w:id="20" w:name="__RefHeading___Toc1275_2871792748"/>
       <w:bookmarkEnd w:id="20"/>
       <w:r>
         <w:rPr/>
@@ -7467,7 +7467,7 @@
         <w:spacing w:before="280" w:after="120"/>
         <w:rPr/>
       </w:pPr>
-      <w:bookmarkStart w:id="21" w:name="__RefHeading___Toc1277_3719902292"/>
+      <w:bookmarkStart w:id="21" w:name="__RefHeading___Toc1277_2871792748"/>
       <w:bookmarkEnd w:id="21"/>
       <w:r>
         <w:rPr/>
@@ -8039,7 +8039,7 @@
         <w:spacing w:before="360" w:after="160"/>
         <w:rPr/>
       </w:pPr>
-      <w:bookmarkStart w:id="22" w:name="__RefHeading___Toc1279_3719902292"/>
+      <w:bookmarkStart w:id="22" w:name="__RefHeading___Toc1279_2871792748"/>
       <w:bookmarkEnd w:id="22"/>
       <w:r>
         <w:rPr/>
@@ -8052,7 +8052,7 @@
         <w:spacing w:before="280" w:after="120"/>
         <w:rPr/>
       </w:pPr>
-      <w:bookmarkStart w:id="23" w:name="__RefHeading___Toc1281_3719902292"/>
+      <w:bookmarkStart w:id="23" w:name="__RefHeading___Toc1281_2871792748"/>
       <w:bookmarkEnd w:id="23"/>
       <w:r>
         <w:rPr/>
@@ -8263,7 +8263,7 @@
         <w:spacing w:before="280" w:after="120"/>
         <w:rPr/>
       </w:pPr>
-      <w:bookmarkStart w:id="24" w:name="__RefHeading___Toc1283_3719902292"/>
+      <w:bookmarkStart w:id="24" w:name="__RefHeading___Toc1283_2871792748"/>
       <w:bookmarkEnd w:id="24"/>
       <w:r>
         <w:rPr/>
@@ -8463,7 +8463,7 @@
         <w:spacing w:before="280" w:after="120"/>
         <w:rPr/>
       </w:pPr>
-      <w:bookmarkStart w:id="25" w:name="__RefHeading___Toc1285_3719902292"/>
+      <w:bookmarkStart w:id="25" w:name="__RefHeading___Toc1285_2871792748"/>
       <w:bookmarkEnd w:id="25"/>
       <w:r>
         <w:rPr/>
@@ -8608,7 +8608,7 @@
         <w:spacing w:before="280" w:after="120"/>
         <w:rPr/>
       </w:pPr>
-      <w:bookmarkStart w:id="26" w:name="__RefHeading___Toc1287_3719902292"/>
+      <w:bookmarkStart w:id="26" w:name="__RefHeading___Toc1287_2871792748"/>
       <w:bookmarkEnd w:id="26"/>
       <w:r>
         <w:rPr/>
@@ -8632,7 +8632,7 @@
         <w:spacing w:before="360" w:after="160"/>
         <w:rPr/>
       </w:pPr>
-      <w:bookmarkStart w:id="27" w:name="__RefHeading___Toc1289_3719902292"/>
+      <w:bookmarkStart w:id="27" w:name="__RefHeading___Toc1289_2871792748"/>
       <w:bookmarkEnd w:id="27"/>
       <w:r>
         <w:rPr/>
@@ -8645,7 +8645,7 @@
         <w:spacing w:before="280" w:after="120"/>
         <w:rPr/>
       </w:pPr>
-      <w:bookmarkStart w:id="28" w:name="__RefHeading___Toc1291_3719902292"/>
+      <w:bookmarkStart w:id="28" w:name="__RefHeading___Toc1291_2871792748"/>
       <w:bookmarkEnd w:id="28"/>
       <w:r>
         <w:rPr/>
@@ -9401,7 +9401,7 @@
         <w:spacing w:before="280" w:after="120"/>
         <w:rPr/>
       </w:pPr>
-      <w:bookmarkStart w:id="29" w:name="__RefHeading___Toc1293_3719902292"/>
+      <w:bookmarkStart w:id="29" w:name="__RefHeading___Toc1293_2871792748"/>
       <w:bookmarkEnd w:id="29"/>
       <w:r>
         <w:rPr/>
@@ -9914,7 +9914,7 @@
         <w:spacing w:before="360" w:after="160"/>
         <w:rPr/>
       </w:pPr>
-      <w:bookmarkStart w:id="30" w:name="__RefHeading___Toc1295_3719902292"/>
+      <w:bookmarkStart w:id="30" w:name="__RefHeading___Toc1295_2871792748"/>
       <w:bookmarkEnd w:id="30"/>
       <w:r>
         <w:rPr/>
@@ -10651,7 +10651,7 @@
         <w:spacing w:before="360" w:after="160"/>
         <w:rPr/>
       </w:pPr>
-      <w:bookmarkStart w:id="31" w:name="__RefHeading___Toc1297_3719902292"/>
+      <w:bookmarkStart w:id="31" w:name="__RefHeading___Toc1297_2871792748"/>
       <w:bookmarkEnd w:id="31"/>
       <w:r>
         <w:rPr/>
@@ -10664,7 +10664,7 @@
         <w:spacing w:before="280" w:after="120"/>
         <w:rPr/>
       </w:pPr>
-      <w:bookmarkStart w:id="32" w:name="__RefHeading___Toc1299_3719902292"/>
+      <w:bookmarkStart w:id="32" w:name="__RefHeading___Toc1299_2871792748"/>
       <w:bookmarkEnd w:id="32"/>
       <w:r>
         <w:rPr/>
@@ -10798,7 +10798,7 @@
         <w:spacing w:before="280" w:after="120"/>
         <w:rPr/>
       </w:pPr>
-      <w:bookmarkStart w:id="33" w:name="__RefHeading___Toc1301_3719902292"/>
+      <w:bookmarkStart w:id="33" w:name="__RefHeading___Toc1301_2871792748"/>
       <w:bookmarkEnd w:id="33"/>
       <w:r>
         <w:rPr/>
@@ -10886,7 +10886,7 @@
         <w:spacing w:before="280" w:after="120"/>
         <w:rPr/>
       </w:pPr>
-      <w:bookmarkStart w:id="34" w:name="__RefHeading___Toc1303_3719902292"/>
+      <w:bookmarkStart w:id="34" w:name="__RefHeading___Toc1303_2871792748"/>
       <w:bookmarkEnd w:id="34"/>
       <w:r>
         <w:rPr/>
@@ -10959,7 +10959,7 @@
         <w:spacing w:before="360" w:after="160"/>
         <w:rPr/>
       </w:pPr>
-      <w:bookmarkStart w:id="35" w:name="__RefHeading___Toc1305_3719902292"/>
+      <w:bookmarkStart w:id="35" w:name="__RefHeading___Toc1305_2871792748"/>
       <w:bookmarkEnd w:id="35"/>
       <w:r>
         <w:rPr/>

</xml_diff>